<commit_message>
Resume: Senior Associate - Data Privacy @ EY (MNC)
</commit_message>
<xml_diff>
--- a/resumes/Resume_Senior_Associate_-_Data_Privacy_EY__MNC_.docx
+++ b/resumes/Resume_Senior_Associate_-_Data_Privacy_EY__MNC_.docx
@@ -413,7 +413,7 @@
           <w:sz w:val="19"/>
           <w:szCs w:val="19"/>
         </w:rPr>
-        <w:t>Triaged 50+ weekly inventory reimbursement cases by severity and policy eligibility, ensuring compliance with data protection regulations and risk management frameworks.</w:t>
+        <w:t>Triaged 50+ weekly inventory reimbursement cases by severity and policy eligibility, following structured case triage and escalation workflows to ensure data privacy compliance.</w:t>
       </w:r>
     </w:p>
     <w:p>
@@ -432,7 +432,7 @@
           <w:sz w:val="19"/>
           <w:szCs w:val="19"/>
         </w:rPr>
-        <w:t>Performed root cause analysis on seller claims to identify policy violations and anomalous patterns, demonstrating investigative instincts essential for data privacy and information security.</w:t>
+        <w:t>Investigated seller claims, identifying policy violations and anomalous patterns, and escalated findings to senior reviewers for data protection and risk management.</w:t>
       </w:r>
     </w:p>
     <w:p>
@@ -451,7 +451,7 @@
           <w:sz w:val="19"/>
           <w:szCs w:val="19"/>
         </w:rPr>
-        <w:t>Maintained audit-ready case documentation recording investigation findings, decisions, and corrective actions, establishing the evidence chain-of-custody discipline required for IT audit and GRC.</w:t>
+        <w:t>Maintained audit-ready case documentation, recording investigation findings, decisions, corrective actions, and evidence notes to support compliance and regulation.</w:t>
       </w:r>
     </w:p>
     <w:p>
@@ -470,7 +470,7 @@
           <w:sz w:val="19"/>
           <w:szCs w:val="19"/>
         </w:rPr>
-        <w:t>Spotted recurring fraud patterns across 200+ weekly cases and flagged them early — cutting repeat-issue investigation time before escalation, thereby enhancing data management and risk management.</w:t>
+        <w:t>Spotted recurring fraud patterns across 200+ weekly cases and flagged them early, reducing repeat-issue investigation time before escalation to ensure information security and risk management.</w:t>
       </w:r>
       <w:r>
         <w:rPr>
@@ -586,7 +586,7 @@
           <w:sz w:val="19"/>
           <w:szCs w:val="19"/>
         </w:rPr>
-        <w:t>Built multi-API threat intelligence pipeline: submits suspicious data to VirusTotal, AbuseIPDB, and URLScan.io; cross-references WHOIS, DNS, and SSL details for unified phishing probability score.</w:t>
+        <w:t>Built multi-API threat intelligence pipeline: submits suspicious data to VirusTotal, AbuseIPDB, and URLScan.io; cross-references WHOIS, DNS, and SSL details for unified phishing score.</w:t>
       </w:r>
     </w:p>
     <w:p>
@@ -605,7 +605,7 @@
           <w:sz w:val="19"/>
           <w:szCs w:val="19"/>
         </w:rPr>
-        <w:t>Developed typosquatting detector generating domain variants and checking DNS resolution to catch brand-impersonation attacks early.</w:t>
+        <w:t>Developed typosquatting detector generating domain variants and checking live DNS resolution to catch brand-impersonation attacks early.</w:t>
       </w:r>
     </w:p>
     <w:p>
@@ -624,7 +624,7 @@
           <w:sz w:val="19"/>
           <w:szCs w:val="19"/>
         </w:rPr>
-        <w:t>Developed Telegram bot interface for live IOC enrichment, supporting bulk CSV input/output and OSINT enrichment via theHarvester for domain profiling.</w:t>
+        <w:t>Deployed Telegram bot interface for live IOC enrichment, supporting bulk CSV input/output and OSINT enrichment via theHarvester for domain profiling.</w:t>
       </w:r>
     </w:p>
     <w:p>
@@ -694,7 +694,7 @@
           <w:sz w:val="19"/>
           <w:szCs w:val="19"/>
         </w:rPr>
-        <w:t>Developed automated vulnerability assessment pipeline using Nessus and OpenVAS REST APIs in Python, generating CVE reports with CVSS severity classification and EPSS scoring from FIRST.org API.</w:t>
+        <w:t>Developed automated vulnerability assessment pipeline integrating Nessus and OpenVAS REST APIs in Python, generating CVE reports with CVSS severity classification and EPSS scoring from FIRST.org API.</w:t>
       </w:r>
     </w:p>
     <w:p>

</xml_diff>